<commit_message>
docs: thêm tài khoản demo member vào ACCOUNT.md (#261)
demo.user1@emesoft.net / Demo@123, role member. Kèm bảng nói rõ màn nào cần
admin (Integrations, credential dùng chung, User Management, audit) và màn nào
xem đúng hơn ở góc nhìn member (project riêng, clone từ shared namespace,
credential Claude cá nhân).

ACCOUNT.md là nguồn của cả hai bộ tài liệu nên build lại cả hai. Đây là ngoại
lệ duy nhất của trạng thái đóng băng ở docs/submission-v2/: thông tin đăng nhập
lệch nhau giữa hai bộ đưa cho Ban Giám khảo là đúng cái drift mà build-docs.ps1
tồn tại để chấm dứt. README của submission-v2 ghi rõ ngoại lệ này.

Tài khoản CHƯA được tạo trên hub live — thay đổi này chỉ là tài liệu.

Closes #261

Co-Authored-By: Claude Opus 5 (1M context) <noreply@anthropic.com>
</commit_message>
<xml_diff>
--- a/docs/submission-v2/EmeHub - Thong tin du an.docx
+++ b/docs/submission-v2/EmeHub - Thong tin du an.docx
@@ -235,7 +235,109 @@
           </w:p>
         </w:tc>
       </w:tr>
+      <w:tr>
+        <w:tc>
+          <w:p>
+            <w:r>
+              <w:t xml:space="preserve">Member</w:t>
+            </w:r>
+          </w:p>
+        </w:tc>
+        <w:tc>
+          <w:p>
+            <w:r>
+              <w:t xml:space="preserve">demo.user1@emesoft.net</w:t>
+            </w:r>
+          </w:p>
+        </w:tc>
+        <w:tc>
+          <w:p>
+            <w:r>
+              <w:t xml:space="preserve">Demo@123</w:t>
+            </w:r>
+          </w:p>
+        </w:tc>
+      </w:tr>
     </w:tbl>
+    <w:p>
+      <w:pPr/>
+      <w:r>
+        <w:rPr/>
+        <w:t xml:space="preserve">Dùng tài khoản nào cho việc gì:</w:t>
+      </w:r>
+    </w:p>
+    <w:tbl>
+      <w:tblPr>
+        <w:tblW w:w="8306" w:type="dxa"/>
+        <w:tblBorders>
+          <w:top w:val="single" w:sz="4"/>
+          <w:left w:val="single" w:sz="4"/>
+          <w:bottom w:val="single" w:sz="4"/>
+          <w:right w:val="single" w:sz="4"/>
+          <w:insideH w:val="single" w:sz="4"/>
+          <w:insideV w:val="single" w:sz="4"/>
+        </w:tblBorders>
+      </w:tblPr>
+      <w:tblGrid>
+        <w:gridCol w:w="4153"/>
+        <w:gridCol w:w="4153"/>
+      </w:tblGrid>
+      <w:tr>
+        <w:tc>
+          <w:p>
+            <w:r>
+              <w:t xml:space="preserve">Xem thứ gì</w:t>
+            </w:r>
+          </w:p>
+        </w:tc>
+        <w:tc>
+          <w:p>
+            <w:r>
+              <w:t xml:space="preserve">Đăng nhập bằng</w:t>
+            </w:r>
+          </w:p>
+        </w:tc>
+      </w:tr>
+      <w:tr>
+        <w:tc>
+          <w:p>
+            <w:r>
+              <w:t xml:space="preserve">Integrations, Claude credential dùng chung, User Management, audit log</w:t>
+            </w:r>
+          </w:p>
+        </w:tc>
+        <w:tc>
+          <w:p>
+            <w:r>
+              <w:t xml:space="preserve">Admin — những màn này yêu cầu role admin</w:t>
+            </w:r>
+          </w:p>
+        </w:tc>
+      </w:tr>
+      <w:tr>
+        <w:tc>
+          <w:p>
+            <w:r>
+              <w:t xml:space="preserve">Project riêng của một thành viên, clone project từ shared namespace, credential Claude cá nhân</w:t>
+            </w:r>
+          </w:p>
+        </w:tc>
+        <w:tc>
+          <w:p>
+            <w:r>
+              <w:t xml:space="preserve">Member — đúng góc nhìn của một QC/QA</w:t>
+            </w:r>
+          </w:p>
+        </w:tc>
+      </w:tr>
+    </w:tbl>
+    <w:p>
+      <w:pPr/>
+      <w:r>
+        <w:rPr/>
+        <w:t xml:space="preserve">Cả hai tài khoản dùng chung một đường đăng nhập ở EmeHub và đều mở được Q-Agent mà không phải đăng nhập lại.</w:t>
+      </w:r>
+    </w:p>
     <w:sectPr>
       <w:pgSz w:w="11906" w:h="16838"/>
       <w:pgMar w:top="1440" w:right="1800" w:bottom="1440" w:left="1800"/>

</xml_diff>

<commit_message>
docs: thêm tài khoản demo member vào ACCOUNT.md (#261) (#262)
demo.user1@emesoft.net / Demo@123, role member. Kèm bảng nói rõ màn nào cần
admin (Integrations, credential dùng chung, User Management, audit) và màn nào
xem đúng hơn ở góc nhìn member (project riêng, clone từ shared namespace,
credential Claude cá nhân).

ACCOUNT.md là nguồn của cả hai bộ tài liệu nên build lại cả hai. Đây là ngoại
lệ duy nhất của trạng thái đóng băng ở docs/submission-v2/: thông tin đăng nhập
lệch nhau giữa hai bộ đưa cho Ban Giám khảo là đúng cái drift mà build-docs.ps1
tồn tại để chấm dứt. README của submission-v2 ghi rõ ngoại lệ này.

Tài khoản CHƯA được tạo trên hub live — thay đổi này chỉ là tài liệu.

Closes #261

Co-authored-by: Claude Opus 5 (1M context) <noreply@anthropic.com>
</commit_message>
<xml_diff>
--- a/docs/submission-v2/EmeHub - Thong tin du an.docx
+++ b/docs/submission-v2/EmeHub - Thong tin du an.docx
@@ -235,7 +235,109 @@
           </w:p>
         </w:tc>
       </w:tr>
+      <w:tr>
+        <w:tc>
+          <w:p>
+            <w:r>
+              <w:t xml:space="preserve">Member</w:t>
+            </w:r>
+          </w:p>
+        </w:tc>
+        <w:tc>
+          <w:p>
+            <w:r>
+              <w:t xml:space="preserve">demo.user1@emesoft.net</w:t>
+            </w:r>
+          </w:p>
+        </w:tc>
+        <w:tc>
+          <w:p>
+            <w:r>
+              <w:t xml:space="preserve">Demo@123</w:t>
+            </w:r>
+          </w:p>
+        </w:tc>
+      </w:tr>
     </w:tbl>
+    <w:p>
+      <w:pPr/>
+      <w:r>
+        <w:rPr/>
+        <w:t xml:space="preserve">Dùng tài khoản nào cho việc gì:</w:t>
+      </w:r>
+    </w:p>
+    <w:tbl>
+      <w:tblPr>
+        <w:tblW w:w="8306" w:type="dxa"/>
+        <w:tblBorders>
+          <w:top w:val="single" w:sz="4"/>
+          <w:left w:val="single" w:sz="4"/>
+          <w:bottom w:val="single" w:sz="4"/>
+          <w:right w:val="single" w:sz="4"/>
+          <w:insideH w:val="single" w:sz="4"/>
+          <w:insideV w:val="single" w:sz="4"/>
+        </w:tblBorders>
+      </w:tblPr>
+      <w:tblGrid>
+        <w:gridCol w:w="4153"/>
+        <w:gridCol w:w="4153"/>
+      </w:tblGrid>
+      <w:tr>
+        <w:tc>
+          <w:p>
+            <w:r>
+              <w:t xml:space="preserve">Xem thứ gì</w:t>
+            </w:r>
+          </w:p>
+        </w:tc>
+        <w:tc>
+          <w:p>
+            <w:r>
+              <w:t xml:space="preserve">Đăng nhập bằng</w:t>
+            </w:r>
+          </w:p>
+        </w:tc>
+      </w:tr>
+      <w:tr>
+        <w:tc>
+          <w:p>
+            <w:r>
+              <w:t xml:space="preserve">Integrations, Claude credential dùng chung, User Management, audit log</w:t>
+            </w:r>
+          </w:p>
+        </w:tc>
+        <w:tc>
+          <w:p>
+            <w:r>
+              <w:t xml:space="preserve">Admin — những màn này yêu cầu role admin</w:t>
+            </w:r>
+          </w:p>
+        </w:tc>
+      </w:tr>
+      <w:tr>
+        <w:tc>
+          <w:p>
+            <w:r>
+              <w:t xml:space="preserve">Project riêng của một thành viên, clone project từ shared namespace, credential Claude cá nhân</w:t>
+            </w:r>
+          </w:p>
+        </w:tc>
+        <w:tc>
+          <w:p>
+            <w:r>
+              <w:t xml:space="preserve">Member — đúng góc nhìn của một QC/QA</w:t>
+            </w:r>
+          </w:p>
+        </w:tc>
+      </w:tr>
+    </w:tbl>
+    <w:p>
+      <w:pPr/>
+      <w:r>
+        <w:rPr/>
+        <w:t xml:space="preserve">Cả hai tài khoản dùng chung một đường đăng nhập ở EmeHub và đều mở được Q-Agent mà không phải đăng nhập lại.</w:t>
+      </w:r>
+    </w:p>
     <w:sectPr>
       <w:pgSz w:w="11906" w:h="16838"/>
       <w:pgMar w:top="1440" w:right="1800" w:bottom="1440" w:left="1800"/>

</xml_diff>

<commit_message>
docs: commit docs/README.md và thêm thông tin repository (#263)
docs/README.md và docs/QAgent.md vào git. Ba link phải sửa trước khi commit vì
chúng trỏ tới file không có trong repo: DAgent.md không tồn tại, HACKATHON.md
còn untracked và mang placeholder chưa điền. Cả hai được thay bằng
product/README.md — bộ tài liệu dự thi đang là bản chính thức.

Framing D-Agent trong docs/README.md đưa về đúng quyết định đã merge ở #255:
ví dụ về agent tương lai gắn vào cùng contract, không phải ứng dụng thứ ba đang
chạy trong bản demo.

ACCOUNT.md thêm mục Source code: hai repo public kèm branch, điểm vào khi đọc
code, và ghi rõ repo D-Agent đang private nên ngoài scope. product/README.md
thêm một dòng repo ở header.

Bỏ bảng "Dùng tài khoản nào cho việc gì" trong ACCOUNT.md.

Rebuild: 13 - Thong tin du an, 00 - Muc luc, và bản v2 của Thong tin du an.

Closes #263

Co-Authored-By: Claude Opus 5 (1M context) <noreply@anthropic.com>
</commit_message>
<xml_diff>
--- a/docs/submission-v2/EmeHub - Thong tin du an.docx
+++ b/docs/submission-v2/EmeHub - Thong tin du an.docx
@@ -263,7 +263,133 @@
       <w:pPr/>
       <w:r>
         <w:rPr/>
-        <w:t xml:space="preserve">Dùng tài khoản nào cho việc gì:</w:t>
+        <w:t xml:space="preserve">Cả hai tài khoản dùng chung một đường đăng nhập ở EmeHub và đều mở được Q-Agent mà không phải đăng nhập lại.</w:t>
+      </w:r>
+    </w:p>
+    <w:p>
+      <w:pPr>
+        <w:pBdr/>
+      </w:pPr>
+    </w:p>
+    <w:p>
+      <w:pPr>
+        <w:pStyle w:val="Heading2"/>
+      </w:pPr>
+      <w:r>
+        <w:rPr>
+          <w:b/>
+          <w:sz w:val="32"/>
+        </w:rPr>
+        <w:t xml:space="preserve">3. Source code</w:t>
+      </w:r>
+    </w:p>
+    <w:tbl>
+      <w:tblPr>
+        <w:tblW w:w="8304" w:type="dxa"/>
+        <w:tblBorders>
+          <w:top w:val="single" w:sz="4"/>
+          <w:left w:val="single" w:sz="4"/>
+          <w:bottom w:val="single" w:sz="4"/>
+          <w:right w:val="single" w:sz="4"/>
+          <w:insideH w:val="single" w:sz="4"/>
+          <w:insideV w:val="single" w:sz="4"/>
+        </w:tblBorders>
+      </w:tblPr>
+      <w:tblGrid>
+        <w:gridCol w:w="2768"/>
+        <w:gridCol w:w="2768"/>
+        <w:gridCol w:w="2768"/>
+      </w:tblGrid>
+      <w:tr>
+        <w:tc>
+          <w:p>
+            <w:r>
+              <w:t xml:space="preserve">Repository</w:t>
+            </w:r>
+          </w:p>
+        </w:tc>
+        <w:tc>
+          <w:p>
+            <w:r>
+              <w:t xml:space="preserve">Ứng dụng</w:t>
+            </w:r>
+          </w:p>
+        </w:tc>
+        <w:tc>
+          <w:p>
+            <w:r>
+              <w:t xml:space="preserve">Trạng thái</w:t>
+            </w:r>
+          </w:p>
+        </w:tc>
+      </w:tr>
+      <w:tr>
+        <w:tc>
+          <w:p>
+            <w:r>
+              <w:t xml:space="preserve">chuongnd2612/emehub (https://github.com/chuongnd2612/emehub)</w:t>
+            </w:r>
+          </w:p>
+        </w:tc>
+        <w:tc>
+          <w:p>
+            <w:r>
+              <w:t xml:space="preserve">EmeHub — hub: identity, credential, project, knowledge base</w:t>
+            </w:r>
+          </w:p>
+        </w:tc>
+        <w:tc>
+          <w:p>
+            <w:r>
+              <w:t xml:space="preserve">Public · branch master</w:t>
+            </w:r>
+          </w:p>
+        </w:tc>
+      </w:tr>
+      <w:tr>
+        <w:tc>
+          <w:p>
+            <w:r>
+              <w:t xml:space="preserve">chuongnd2612/q-agent (https://github.com/chuongnd2612/q-agent)</w:t>
+            </w:r>
+          </w:p>
+        </w:tc>
+        <w:tc>
+          <w:p>
+            <w:r>
+              <w:t xml:space="preserve">Q-Agent — agent cho QC/QA</w:t>
+            </w:r>
+          </w:p>
+        </w:tc>
+        <w:tc>
+          <w:p>
+            <w:r>
+              <w:t xml:space="preserve">Public · branch master</w:t>
+            </w:r>
+          </w:p>
+        </w:tc>
+      </w:tr>
+    </w:tbl>
+    <w:p>
+      <w:pPr/>
+      <w:r>
+        <w:t xml:space="preserve">Hai repository tách nhau và tích hợp qua HTTP, không phải monorepo — contract giữa chúng là một tài liệu thật, </w:t>
+      </w:r>
+      <w:r>
+        <w:rPr>
+          <w:rFonts w:ascii="Consolas" w:hAnsi="Consolas"/>
+        </w:rPr>
+        <w:t xml:space="preserve">docs/INTEGRATION.md</w:t>
+      </w:r>
+      <w:r>
+        <w:t xml:space="preserve"> trong repo hub.</w:t>
+      </w:r>
+    </w:p>
+    <w:p>
+      <w:pPr/>
+      <w:r>
+        <w:rPr/>
+        <w:t xml:space="preserve">Điểm vào khi đọc code:</w:t>
       </w:r>
     </w:p>
     <w:tbl>
@@ -286,56 +412,163 @@
         <w:tc>
           <w:p>
             <w:r>
-              <w:t xml:space="preserve">Xem thứ gì</w:t>
-            </w:r>
-          </w:p>
-        </w:tc>
-        <w:tc>
-          <w:p>
-            <w:r>
-              <w:t xml:space="preserve">Đăng nhập bằng</w:t>
-            </w:r>
-          </w:p>
-        </w:tc>
-      </w:tr>
-      <w:tr>
-        <w:tc>
-          <w:p>
-            <w:r>
-              <w:t xml:space="preserve">Integrations, Claude credential dùng chung, User Management, audit log</w:t>
-            </w:r>
-          </w:p>
-        </w:tc>
-        <w:tc>
-          <w:p>
-            <w:r>
-              <w:t xml:space="preserve">Admin — những màn này yêu cầu role admin</w:t>
-            </w:r>
-          </w:p>
-        </w:tc>
-      </w:tr>
-      <w:tr>
-        <w:tc>
-          <w:p>
-            <w:r>
-              <w:t xml:space="preserve">Project riêng của một thành viên, clone project từ shared namespace, credential Claude cá nhân</w:t>
-            </w:r>
-          </w:p>
-        </w:tc>
-        <w:tc>
-          <w:p>
-            <w:r>
-              <w:t xml:space="preserve">Member — đúng góc nhìn của một QC/QA</w:t>
+              <w:t xml:space="preserve">Muốn xem</w:t>
+            </w:r>
+          </w:p>
+        </w:tc>
+        <w:tc>
+          <w:p>
+            <w:r>
+              <w:t xml:space="preserve">Ở đâu</w:t>
+            </w:r>
+          </w:p>
+        </w:tc>
+      </w:tr>
+      <w:tr>
+        <w:tc>
+          <w:p>
+            <w:r>
+              <w:t xml:space="preserve">Bộ tài liệu dự thi</w:t>
+            </w:r>
+          </w:p>
+        </w:tc>
+        <w:tc>
+          <w:p>
+            <w:r>
+              <w:t xml:space="preserve">emehub/docs/product/</w:t>
+            </w:r>
+          </w:p>
+        </w:tc>
+      </w:tr>
+      <w:tr>
+        <w:tc>
+          <w:p>
+            <w:r>
+              <w:t xml:space="preserve">Quyết định kiến trúc kèm lý do</w:t>
+            </w:r>
+          </w:p>
+        </w:tc>
+        <w:tc>
+          <w:p>
+            <w:r>
+              <w:t xml:space="preserve">emehub/docs/adr/</w:t>
+            </w:r>
+          </w:p>
+        </w:tc>
+      </w:tr>
+      <w:tr>
+        <w:tc>
+          <w:p>
+            <w:r>
+              <w:t xml:space="preserve">Contract giữa hub và agent</w:t>
+            </w:r>
+          </w:p>
+        </w:tc>
+        <w:tc>
+          <w:p>
+            <w:r>
+              <w:t xml:space="preserve">emehub/docs/INTEGRATION.md</w:t>
+            </w:r>
+          </w:p>
+        </w:tc>
+      </w:tr>
+      <w:tr>
+        <w:tc>
+          <w:p>
+            <w:r>
+              <w:t xml:space="preserve">Backend hub (FastAPI)</w:t>
+            </w:r>
+          </w:p>
+        </w:tc>
+        <w:tc>
+          <w:p>
+            <w:r>
+              <w:t xml:space="preserve">emehub/api/app/</w:t>
+            </w:r>
+          </w:p>
+        </w:tc>
+      </w:tr>
+      <w:tr>
+        <w:tc>
+          <w:p>
+            <w:r>
+              <w:t xml:space="preserve">Frontend hub (React)</w:t>
+            </w:r>
+          </w:p>
+        </w:tc>
+        <w:tc>
+          <w:p>
+            <w:r>
+              <w:t xml:space="preserve">emehub/app/src/</w:t>
+            </w:r>
+          </w:p>
+        </w:tc>
+      </w:tr>
+      <w:tr>
+        <w:tc>
+          <w:p>
+            <w:r>
+              <w:t xml:space="preserve">Skill của Q-Agent</w:t>
+            </w:r>
+          </w:p>
+        </w:tc>
+        <w:tc>
+          <w:p>
+            <w:r>
+              <w:t xml:space="preserve">q-agent/skills/</w:t>
             </w:r>
           </w:p>
         </w:tc>
       </w:tr>
     </w:tbl>
     <w:p>
-      <w:pPr/>
-      <w:r>
-        <w:rPr/>
-        <w:t xml:space="preserve">Cả hai tài khoản dùng chung một đường đăng nhập ở EmeHub và đều mở được Q-Agent mà không phải đăng nhập lại.</w:t>
+      <w:pPr>
+        <w:ind w:left="720"/>
+      </w:pPr>
+      <w:r>
+        <w:rPr>
+          <w:i/>
+        </w:rPr>
+        <w:t xml:space="preserve">Repo của </w:t>
+      </w:r>
+      <w:r>
+        <w:rPr>
+          <w:b/>
+          <w:i/>
+        </w:rPr>
+        <w:t xml:space="preserve">D-Agent</w:t>
+      </w:r>
+      <w:r>
+        <w:rPr>
+          <w:i/>
+        </w:rPr>
+        <w:t xml:space="preserve"> (</w:t>
+      </w:r>
+      <w:r>
+        <w:rPr>
+          <w:rFonts w:ascii="Consolas" w:hAnsi="Consolas"/>
+          <w:i/>
+        </w:rPr>
+        <w:t xml:space="preserve">DaoLinh98/ticket-executor</w:t>
+      </w:r>
+      <w:r>
+        <w:rPr>
+          <w:i/>
+        </w:rPr>
+        <w:t xml:space="preserve">) đang private và </w:t>
+      </w:r>
+      <w:r>
+        <w:rPr>
+          <w:b/>
+          <w:i/>
+        </w:rPr>
+        <w:t xml:space="preserve">không nằm trong scope bản dự thi</w:t>
+      </w:r>
+      <w:r>
+        <w:rPr>
+          <w:i/>
+        </w:rPr>
+        <w:t xml:space="preserve"> — D-Agent là ví dụ về agent tương lai gắn vào cùng contract, không phải ứng dụng thứ ba đang chạy.</w:t>
       </w:r>
     </w:p>
     <w:sectPr>

</xml_diff>

<commit_message>
docs: commit docs/README.md và thêm thông tin repository (#263) (#264)
docs/README.md và docs/QAgent.md vào git. Ba link phải sửa trước khi commit vì
chúng trỏ tới file không có trong repo: DAgent.md không tồn tại, HACKATHON.md
còn untracked và mang placeholder chưa điền. Cả hai được thay bằng
product/README.md — bộ tài liệu dự thi đang là bản chính thức.

Framing D-Agent trong docs/README.md đưa về đúng quyết định đã merge ở #255:
ví dụ về agent tương lai gắn vào cùng contract, không phải ứng dụng thứ ba đang
chạy trong bản demo.

ACCOUNT.md thêm mục Source code: hai repo public kèm branch, điểm vào khi đọc
code, và ghi rõ repo D-Agent đang private nên ngoài scope. product/README.md
thêm một dòng repo ở header.

Bỏ bảng "Dùng tài khoản nào cho việc gì" trong ACCOUNT.md.

Rebuild: 13 - Thong tin du an, 00 - Muc luc, và bản v2 của Thong tin du an.

Closes #263

Co-authored-by: Claude Opus 5 (1M context) <noreply@anthropic.com>
</commit_message>
<xml_diff>
--- a/docs/submission-v2/EmeHub - Thong tin du an.docx
+++ b/docs/submission-v2/EmeHub - Thong tin du an.docx
@@ -263,7 +263,133 @@
       <w:pPr/>
       <w:r>
         <w:rPr/>
-        <w:t xml:space="preserve">Dùng tài khoản nào cho việc gì:</w:t>
+        <w:t xml:space="preserve">Cả hai tài khoản dùng chung một đường đăng nhập ở EmeHub và đều mở được Q-Agent mà không phải đăng nhập lại.</w:t>
+      </w:r>
+    </w:p>
+    <w:p>
+      <w:pPr>
+        <w:pBdr/>
+      </w:pPr>
+    </w:p>
+    <w:p>
+      <w:pPr>
+        <w:pStyle w:val="Heading2"/>
+      </w:pPr>
+      <w:r>
+        <w:rPr>
+          <w:b/>
+          <w:sz w:val="32"/>
+        </w:rPr>
+        <w:t xml:space="preserve">3. Source code</w:t>
+      </w:r>
+    </w:p>
+    <w:tbl>
+      <w:tblPr>
+        <w:tblW w:w="8304" w:type="dxa"/>
+        <w:tblBorders>
+          <w:top w:val="single" w:sz="4"/>
+          <w:left w:val="single" w:sz="4"/>
+          <w:bottom w:val="single" w:sz="4"/>
+          <w:right w:val="single" w:sz="4"/>
+          <w:insideH w:val="single" w:sz="4"/>
+          <w:insideV w:val="single" w:sz="4"/>
+        </w:tblBorders>
+      </w:tblPr>
+      <w:tblGrid>
+        <w:gridCol w:w="2768"/>
+        <w:gridCol w:w="2768"/>
+        <w:gridCol w:w="2768"/>
+      </w:tblGrid>
+      <w:tr>
+        <w:tc>
+          <w:p>
+            <w:r>
+              <w:t xml:space="preserve">Repository</w:t>
+            </w:r>
+          </w:p>
+        </w:tc>
+        <w:tc>
+          <w:p>
+            <w:r>
+              <w:t xml:space="preserve">Ứng dụng</w:t>
+            </w:r>
+          </w:p>
+        </w:tc>
+        <w:tc>
+          <w:p>
+            <w:r>
+              <w:t xml:space="preserve">Trạng thái</w:t>
+            </w:r>
+          </w:p>
+        </w:tc>
+      </w:tr>
+      <w:tr>
+        <w:tc>
+          <w:p>
+            <w:r>
+              <w:t xml:space="preserve">chuongnd2612/emehub (https://github.com/chuongnd2612/emehub)</w:t>
+            </w:r>
+          </w:p>
+        </w:tc>
+        <w:tc>
+          <w:p>
+            <w:r>
+              <w:t xml:space="preserve">EmeHub — hub: identity, credential, project, knowledge base</w:t>
+            </w:r>
+          </w:p>
+        </w:tc>
+        <w:tc>
+          <w:p>
+            <w:r>
+              <w:t xml:space="preserve">Public · branch master</w:t>
+            </w:r>
+          </w:p>
+        </w:tc>
+      </w:tr>
+      <w:tr>
+        <w:tc>
+          <w:p>
+            <w:r>
+              <w:t xml:space="preserve">chuongnd2612/q-agent (https://github.com/chuongnd2612/q-agent)</w:t>
+            </w:r>
+          </w:p>
+        </w:tc>
+        <w:tc>
+          <w:p>
+            <w:r>
+              <w:t xml:space="preserve">Q-Agent — agent cho QC/QA</w:t>
+            </w:r>
+          </w:p>
+        </w:tc>
+        <w:tc>
+          <w:p>
+            <w:r>
+              <w:t xml:space="preserve">Public · branch master</w:t>
+            </w:r>
+          </w:p>
+        </w:tc>
+      </w:tr>
+    </w:tbl>
+    <w:p>
+      <w:pPr/>
+      <w:r>
+        <w:t xml:space="preserve">Hai repository tách nhau và tích hợp qua HTTP, không phải monorepo — contract giữa chúng là một tài liệu thật, </w:t>
+      </w:r>
+      <w:r>
+        <w:rPr>
+          <w:rFonts w:ascii="Consolas" w:hAnsi="Consolas"/>
+        </w:rPr>
+        <w:t xml:space="preserve">docs/INTEGRATION.md</w:t>
+      </w:r>
+      <w:r>
+        <w:t xml:space="preserve"> trong repo hub.</w:t>
+      </w:r>
+    </w:p>
+    <w:p>
+      <w:pPr/>
+      <w:r>
+        <w:rPr/>
+        <w:t xml:space="preserve">Điểm vào khi đọc code:</w:t>
       </w:r>
     </w:p>
     <w:tbl>
@@ -286,56 +412,163 @@
         <w:tc>
           <w:p>
             <w:r>
-              <w:t xml:space="preserve">Xem thứ gì</w:t>
-            </w:r>
-          </w:p>
-        </w:tc>
-        <w:tc>
-          <w:p>
-            <w:r>
-              <w:t xml:space="preserve">Đăng nhập bằng</w:t>
-            </w:r>
-          </w:p>
-        </w:tc>
-      </w:tr>
-      <w:tr>
-        <w:tc>
-          <w:p>
-            <w:r>
-              <w:t xml:space="preserve">Integrations, Claude credential dùng chung, User Management, audit log</w:t>
-            </w:r>
-          </w:p>
-        </w:tc>
-        <w:tc>
-          <w:p>
-            <w:r>
-              <w:t xml:space="preserve">Admin — những màn này yêu cầu role admin</w:t>
-            </w:r>
-          </w:p>
-        </w:tc>
-      </w:tr>
-      <w:tr>
-        <w:tc>
-          <w:p>
-            <w:r>
-              <w:t xml:space="preserve">Project riêng của một thành viên, clone project từ shared namespace, credential Claude cá nhân</w:t>
-            </w:r>
-          </w:p>
-        </w:tc>
-        <w:tc>
-          <w:p>
-            <w:r>
-              <w:t xml:space="preserve">Member — đúng góc nhìn của một QC/QA</w:t>
+              <w:t xml:space="preserve">Muốn xem</w:t>
+            </w:r>
+          </w:p>
+        </w:tc>
+        <w:tc>
+          <w:p>
+            <w:r>
+              <w:t xml:space="preserve">Ở đâu</w:t>
+            </w:r>
+          </w:p>
+        </w:tc>
+      </w:tr>
+      <w:tr>
+        <w:tc>
+          <w:p>
+            <w:r>
+              <w:t xml:space="preserve">Bộ tài liệu dự thi</w:t>
+            </w:r>
+          </w:p>
+        </w:tc>
+        <w:tc>
+          <w:p>
+            <w:r>
+              <w:t xml:space="preserve">emehub/docs/product/</w:t>
+            </w:r>
+          </w:p>
+        </w:tc>
+      </w:tr>
+      <w:tr>
+        <w:tc>
+          <w:p>
+            <w:r>
+              <w:t xml:space="preserve">Quyết định kiến trúc kèm lý do</w:t>
+            </w:r>
+          </w:p>
+        </w:tc>
+        <w:tc>
+          <w:p>
+            <w:r>
+              <w:t xml:space="preserve">emehub/docs/adr/</w:t>
+            </w:r>
+          </w:p>
+        </w:tc>
+      </w:tr>
+      <w:tr>
+        <w:tc>
+          <w:p>
+            <w:r>
+              <w:t xml:space="preserve">Contract giữa hub và agent</w:t>
+            </w:r>
+          </w:p>
+        </w:tc>
+        <w:tc>
+          <w:p>
+            <w:r>
+              <w:t xml:space="preserve">emehub/docs/INTEGRATION.md</w:t>
+            </w:r>
+          </w:p>
+        </w:tc>
+      </w:tr>
+      <w:tr>
+        <w:tc>
+          <w:p>
+            <w:r>
+              <w:t xml:space="preserve">Backend hub (FastAPI)</w:t>
+            </w:r>
+          </w:p>
+        </w:tc>
+        <w:tc>
+          <w:p>
+            <w:r>
+              <w:t xml:space="preserve">emehub/api/app/</w:t>
+            </w:r>
+          </w:p>
+        </w:tc>
+      </w:tr>
+      <w:tr>
+        <w:tc>
+          <w:p>
+            <w:r>
+              <w:t xml:space="preserve">Frontend hub (React)</w:t>
+            </w:r>
+          </w:p>
+        </w:tc>
+        <w:tc>
+          <w:p>
+            <w:r>
+              <w:t xml:space="preserve">emehub/app/src/</w:t>
+            </w:r>
+          </w:p>
+        </w:tc>
+      </w:tr>
+      <w:tr>
+        <w:tc>
+          <w:p>
+            <w:r>
+              <w:t xml:space="preserve">Skill của Q-Agent</w:t>
+            </w:r>
+          </w:p>
+        </w:tc>
+        <w:tc>
+          <w:p>
+            <w:r>
+              <w:t xml:space="preserve">q-agent/skills/</w:t>
             </w:r>
           </w:p>
         </w:tc>
       </w:tr>
     </w:tbl>
     <w:p>
-      <w:pPr/>
-      <w:r>
-        <w:rPr/>
-        <w:t xml:space="preserve">Cả hai tài khoản dùng chung một đường đăng nhập ở EmeHub và đều mở được Q-Agent mà không phải đăng nhập lại.</w:t>
+      <w:pPr>
+        <w:ind w:left="720"/>
+      </w:pPr>
+      <w:r>
+        <w:rPr>
+          <w:i/>
+        </w:rPr>
+        <w:t xml:space="preserve">Repo của </w:t>
+      </w:r>
+      <w:r>
+        <w:rPr>
+          <w:b/>
+          <w:i/>
+        </w:rPr>
+        <w:t xml:space="preserve">D-Agent</w:t>
+      </w:r>
+      <w:r>
+        <w:rPr>
+          <w:i/>
+        </w:rPr>
+        <w:t xml:space="preserve"> (</w:t>
+      </w:r>
+      <w:r>
+        <w:rPr>
+          <w:rFonts w:ascii="Consolas" w:hAnsi="Consolas"/>
+          <w:i/>
+        </w:rPr>
+        <w:t xml:space="preserve">DaoLinh98/ticket-executor</w:t>
+      </w:r>
+      <w:r>
+        <w:rPr>
+          <w:i/>
+        </w:rPr>
+        <w:t xml:space="preserve">) đang private và </w:t>
+      </w:r>
+      <w:r>
+        <w:rPr>
+          <w:b/>
+          <w:i/>
+        </w:rPr>
+        <w:t xml:space="preserve">không nằm trong scope bản dự thi</w:t>
+      </w:r>
+      <w:r>
+        <w:rPr>
+          <w:i/>
+        </w:rPr>
+        <w:t xml:space="preserve"> — D-Agent là ví dụ về agent tương lai gắn vào cùng contract, không phải ứng dụng thứ ba đang chạy.</w:t>
       </w:r>
     </w:p>
     <w:sectPr>

</xml_diff>

<commit_message>
docs: bỏ note về D-Agent trong ACCOUNT.md (#265)
Mục Source code chỉ liệt kê hai repo đang dùng. Blockquote giải thích repo
D-Agent private và ngoài scope là thông tin về một repo không có trong bảng —
bỏ. Framing D-Agent vẫn còn ở docs/README.md và bộ tài liệu dự thi.

Rebuild: 13 - Thong tin du an và bản v2.

Closes #265

Co-Authored-By: Claude Opus 5 (1M context) <noreply@anthropic.com>
</commit_message>
<xml_diff>
--- a/docs/submission-v2/EmeHub - Thong tin du an.docx
+++ b/docs/submission-v2/EmeHub - Thong tin du an.docx
@@ -521,56 +521,6 @@
         </w:tc>
       </w:tr>
     </w:tbl>
-    <w:p>
-      <w:pPr>
-        <w:ind w:left="720"/>
-      </w:pPr>
-      <w:r>
-        <w:rPr>
-          <w:i/>
-        </w:rPr>
-        <w:t xml:space="preserve">Repo của </w:t>
-      </w:r>
-      <w:r>
-        <w:rPr>
-          <w:b/>
-          <w:i/>
-        </w:rPr>
-        <w:t xml:space="preserve">D-Agent</w:t>
-      </w:r>
-      <w:r>
-        <w:rPr>
-          <w:i/>
-        </w:rPr>
-        <w:t xml:space="preserve"> (</w:t>
-      </w:r>
-      <w:r>
-        <w:rPr>
-          <w:rFonts w:ascii="Consolas" w:hAnsi="Consolas"/>
-          <w:i/>
-        </w:rPr>
-        <w:t xml:space="preserve">DaoLinh98/ticket-executor</w:t>
-      </w:r>
-      <w:r>
-        <w:rPr>
-          <w:i/>
-        </w:rPr>
-        <w:t xml:space="preserve">) đang private và </w:t>
-      </w:r>
-      <w:r>
-        <w:rPr>
-          <w:b/>
-          <w:i/>
-        </w:rPr>
-        <w:t xml:space="preserve">không nằm trong scope bản dự thi</w:t>
-      </w:r>
-      <w:r>
-        <w:rPr>
-          <w:i/>
-        </w:rPr>
-        <w:t xml:space="preserve"> — D-Agent là ví dụ về agent tương lai gắn vào cùng contract, không phải ứng dụng thứ ba đang chạy.</w:t>
-      </w:r>
-    </w:p>
     <w:sectPr>
       <w:pgSz w:w="11906" w:h="16838"/>
       <w:pgMar w:top="1440" w:right="1800" w:bottom="1440" w:left="1800"/>

</xml_diff>

<commit_message>
docs: bỏ note về D-Agent trong ACCOUNT.md (#265) (#266)
Mục Source code chỉ liệt kê hai repo đang dùng. Blockquote giải thích repo
D-Agent private và ngoài scope là thông tin về một repo không có trong bảng —
bỏ. Framing D-Agent vẫn còn ở docs/README.md và bộ tài liệu dự thi.

Rebuild: 13 - Thong tin du an và bản v2.

Closes #265

Co-authored-by: Claude Opus 5 (1M context) <noreply@anthropic.com>
</commit_message>
<xml_diff>
--- a/docs/submission-v2/EmeHub - Thong tin du an.docx
+++ b/docs/submission-v2/EmeHub - Thong tin du an.docx
@@ -521,56 +521,6 @@
         </w:tc>
       </w:tr>
     </w:tbl>
-    <w:p>
-      <w:pPr>
-        <w:ind w:left="720"/>
-      </w:pPr>
-      <w:r>
-        <w:rPr>
-          <w:i/>
-        </w:rPr>
-        <w:t xml:space="preserve">Repo của </w:t>
-      </w:r>
-      <w:r>
-        <w:rPr>
-          <w:b/>
-          <w:i/>
-        </w:rPr>
-        <w:t xml:space="preserve">D-Agent</w:t>
-      </w:r>
-      <w:r>
-        <w:rPr>
-          <w:i/>
-        </w:rPr>
-        <w:t xml:space="preserve"> (</w:t>
-      </w:r>
-      <w:r>
-        <w:rPr>
-          <w:rFonts w:ascii="Consolas" w:hAnsi="Consolas"/>
-          <w:i/>
-        </w:rPr>
-        <w:t xml:space="preserve">DaoLinh98/ticket-executor</w:t>
-      </w:r>
-      <w:r>
-        <w:rPr>
-          <w:i/>
-        </w:rPr>
-        <w:t xml:space="preserve">) đang private và </w:t>
-      </w:r>
-      <w:r>
-        <w:rPr>
-          <w:b/>
-          <w:i/>
-        </w:rPr>
-        <w:t xml:space="preserve">không nằm trong scope bản dự thi</w:t>
-      </w:r>
-      <w:r>
-        <w:rPr>
-          <w:i/>
-        </w:rPr>
-        <w:t xml:space="preserve"> — D-Agent là ví dụ về agent tương lai gắn vào cùng contract, không phải ứng dụng thứ ba đang chạy.</w:t>
-      </w:r>
-    </w:p>
     <w:sectPr>
       <w:pgSz w:w="11906" w:h="16838"/>
       <w:pgMar w:top="1440" w:right="1800" w:bottom="1440" w:left="1800"/>

</xml_diff>